<commit_message>
Otimizar artigo pillar com H2 em formato pergunta e respostas diretas
Aplicadas melhorias de GEO (Generative Engine Optimization):
- Todos os H2 transformados em perguntas
- Primeiro parágrafo de cada seção responde direto a pergunta
- Resposta citável aparece logo no início (< 2 frases)
- Ideal para extração por motores de IA (ChatGPT, Perplexity, Google AI)

H2 atualizados:
- "Qual É o Padrão Que Ninguém Vê?"
- "Quais São os 3 Pilares Que Fazem Diferença?"
- "Como Você Implementa Clareza?"
- "Como Saber Se Sua Clareza Funciona?"
- "O Que Muda Quando Clareza Existe?"

Mantém: narrativa fluida, parágrafos 3-4 frases, voz humana, dados linkados

Co-Authored-By: Claude Haiku 4.5 <noreply@anthropic.com>
Claude-Session: https://claude.ai/code/session_01UTQkPs47i1TrXjSPcL7BG3
</commit_message>
<xml_diff>
--- a/artigos-producao/01-PAUTA1-PILAR-FINAL.docx
+++ b/artigos-producao/01-PAUTA1-PILAR-FINAL.docx
@@ -35,19 +35,19 @@
         <w:pStyle w:val="Heading2"/>
       </w:pPr>
       <w:r>
-        <w:t>O Padrão Que Ninguém Vê</w:t>
+        <w:t>Qual É o Padrão Que Ninguém Vê?</w:t>
       </w:r>
     </w:p>
     <w:p/>
     <w:p>
       <w:r>
-        <w:t>Observe esse engenheiro durante uma semana real. Dia 1: implementa a feature. Você diz "não é isso". Dia 2: refaz. Você: "esperava outra coisa". Dia 3: refaz de novo. A semana toda é assim.</w:t>
+        <w:t>O padrão é adivinhação. Quando clareza não existe, até talento extraordinário passa a semana inteira tentando adivinhar qual é o trabalho prioritário.</w:t>
       </w:r>
     </w:p>
     <w:p/>
     <w:p>
       <w:r>
-        <w:t>Ninguém é incompetente aqui. O que acontece é mais simples: alguém está adivinhando.</w:t>
+        <w:t>Observe esse engenheiro durante uma semana real. Dia 1: implementa a feature. Você diz "não é isso". Dia 2: refaz. Você: "esperava outra coisa". Dia 3: refaz de novo. A semana toda é assim. Ninguém é incompetente aqui. O que acontece é mais simples: ele está adivinhando.</w:t>
       </w:r>
     </w:p>
     <w:p/>
@@ -57,23 +57,21 @@
       </w:r>
       <w:r>
         <w:rPr>
-          <w:color w:val="0000FF"/>
           <w:u w:val="single"/>
         </w:rPr>
         <w:t>Harvard Business Review descobriu que ausência de clareza estratégica é a segunda maior causa de turnover — atrás apenas de compensação</w:t>
       </w:r>
       <w:r>
-        <w:t xml:space="preserve">. </w:t>
+        <w:t xml:space="preserve">. Mais específico ainda: </w:t>
       </w:r>
       <w:r>
         <w:rPr>
-          <w:color w:val="0000FF"/>
           <w:u w:val="single"/>
         </w:rPr>
         <w:t>65% dos high performers saem de empresas por "falta de clareza sobre para onde empresa vai"</w:t>
       </w:r>
       <w:r>
-        <w:t xml:space="preserve">. </w:t>
+        <w:t>.</w:t>
       </w:r>
     </w:p>
     <w:p/>
@@ -88,19 +86,13 @@
         <w:pStyle w:val="Heading2"/>
       </w:pPr>
       <w:r>
-        <w:t>Os 3 Pilares Que Fazem Diferença</w:t>
+        <w:t>Quais São os 3 Pilares Que Fazem Diferença?</w:t>
       </w:r>
     </w:p>
     <w:p/>
     <w:p>
       <w:r>
-        <w:t>Quando clareza existe, até talento em ambiente desafiador consegue prosperar. Quando não existe, até talento extraordinário vira frustração.</w:t>
-      </w:r>
-    </w:p>
-    <w:p/>
-    <w:p>
-      <w:r>
-        <w:t>Existem três pilares que, quando presentes, fazem talento prosperar mesmo com pressão:</w:t>
+        <w:t>Existem três pilares: clareza estratégica, transparência em decisão e autonomia para agir. Quando os três estão presentes, talento prospera mesmo em ambiente desafiador. Quando falta um, talento vira frustração.</w:t>
       </w:r>
     </w:p>
     <w:p/>
@@ -112,14 +104,13 @@
     <w:p/>
     <w:p>
       <w:r>
-        <w:t>Isso não é complicado. É simples: qual é a estratégia de negócio? Qual problema vocês resolvem? Por que essa direção?</w:t>
+        <w:t>Clareza estratégica significa que seu time compreende qual é o negócio, qual problema vocês resolvem e por que essa direção foi escolhida. Não é complicado. É simples.</w:t>
       </w:r>
     </w:p>
     <w:p/>
     <w:p>
       <w:r>
         <w:rPr>
-          <w:color w:val="0000FF"/>
           <w:u w:val="single"/>
         </w:rPr>
         <w:t>70% dos colaboradores não entendem completamente a estratégia</w:t>
@@ -134,29 +125,16 @@
     <w:p/>
     <w:p>
       <w:r>
-        <w:t>Transparência aqui não significa concordância. Significa contexto.</w:t>
+        <w:t>Transparência em decisão não significa concordância. Significa contexto. Quando você explica — "Decidimos fazer X porque temos Y dados e Z contexto externo" — talento consegue confiar mesmo discordando.</w:t>
       </w:r>
     </w:p>
     <w:p/>
     <w:p>
       <w:r>
-        <w:t xml:space="preserve">Quando você explica — "Decidimos fazer X porque temos Y dados e Z contexto externo" — talento consegue confiar mesmo discordando. </w:t>
-      </w:r>
-      <w:r>
         <w:rPr>
-          <w:color w:val="0000FF"/>
           <w:u w:val="single"/>
         </w:rPr>
         <w:t>Transparência em decisão aumenta confiança em liderança em 67%</w:t>
-      </w:r>
-      <w:r>
-        <w:t xml:space="preserve">. </w:t>
-      </w:r>
-    </w:p>
-    <w:p/>
-    <w:p>
-      <w:r>
-        <w:t>Talento discorda de decisões ruins. Talento não discorda de transparência.</w:t>
       </w:r>
     </w:p>
     <w:p/>
@@ -175,7 +153,6 @@
     <w:p>
       <w:r>
         <w:rPr>
-          <w:color w:val="0000FF"/>
           <w:u w:val="single"/>
         </w:rPr>
         <w:t>Colaboradores com autonomia têm 50% menos burnout</w:t>
@@ -187,13 +164,13 @@
         <w:pStyle w:val="Heading2"/>
       </w:pPr>
       <w:r>
-        <w:t>Como Implementar Isso</w:t>
+        <w:t>Como Você Implementa Clareza?</w:t>
       </w:r>
     </w:p>
     <w:p/>
     <w:p>
       <w:r>
-        <w:t>A implementação tem três passos práticos.</w:t>
+        <w:t>A implementação tem três passos práticos, cada um com duração de semanas e não de meses.</w:t>
       </w:r>
     </w:p>
     <w:p/>
@@ -205,7 +182,7 @@
     <w:p/>
     <w:p>
       <w:r>
-        <w:t>Se você não consegue resumir em uma frase, não tem estratégia. Tem lista de desejos. "Nós ajudamos CMOs a medir ROI real de atribuição multi-canal." Pronto. Time sabe.</w:t>
+        <w:t>Se você não consegue resumir em uma frase, não tem estratégia. Tem lista de desejos. "Nós ajudamos CMOs a medir ROI real de atribuição multi-canal." Pronto. Time sabe. Quando você consegue resumir, você realmente entendeu o que está fazendo.</w:t>
       </w:r>
     </w:p>
     <w:p/>
@@ -221,13 +198,12 @@
       </w:r>
       <w:r>
         <w:rPr>
-          <w:color w:val="0000FF"/>
           <w:u w:val="single"/>
         </w:rPr>
         <w:t>Empresas que comunicam estratégia 4 vezes ao ano têm 40% menos ambiguidade</w:t>
       </w:r>
       <w:r>
-        <w:t xml:space="preserve">. </w:t>
+        <w:t>.</w:t>
       </w:r>
     </w:p>
     <w:p/>
@@ -245,13 +221,7 @@
     <w:p/>
     <w:p>
       <w:r>
-        <w:t>Time precisa entender como você toma decisão. Qual contexto você considera crítico? Qual dado pesa mais? Quando você muda de ideia e por quê?</w:t>
-      </w:r>
-    </w:p>
-    <w:p/>
-    <w:p>
-      <w:r>
-        <w:t>Quando isso fica transparente, talento consegue antecipar seu raciocínio e tomar decisão pequena sozinho, sem precisar consultar você antes.</w:t>
+        <w:t>Time precisa entender como você toma decisão. Qual contexto você considera crítico? Qual dado pesa mais? Quando você muda de ideia e por quê? Quando isso fica transparente, talento consegue antecipar seu raciocínio e tomar decisão pequena sozinho, sem precisar consultar você antes.</w:t>
       </w:r>
     </w:p>
     <w:p/>
@@ -260,13 +230,13 @@
         <w:pStyle w:val="Heading2"/>
       </w:pPr>
       <w:r>
-        <w:t>O Teste Mais Importante</w:t>
+        <w:t>Como Saber Se Sua Clareza Funciona?</w:t>
       </w:r>
     </w:p>
     <w:p/>
     <w:p>
       <w:r>
-        <w:t>Depois de implementar clareza, existe um teste simples. Semana depois que você comunicar estratégia, pergunte para três pessoas do time: qual é a estratégia em uma frase? Por que vocês decidiram isso? Como você vai contribuir?</w:t>
+        <w:t>Existe um teste simples: pergunte para três pessoas do time. Semana depois que você comunicar estratégia, faça três perguntas básicas: qual é a estratégia em uma frase? Por que vocês decidiram isso? Como você vai contribuir?</w:t>
       </w:r>
     </w:p>
     <w:p/>
@@ -276,13 +246,12 @@
       </w:r>
       <w:r>
         <w:rPr>
-          <w:color w:val="0000FF"/>
           <w:u w:val="single"/>
         </w:rPr>
         <w:t>Apenas 30% dos colaboradores conseguem articular estratégia da empresa quando perguntados de surpresa</w:t>
       </w:r>
       <w:r>
-        <w:t xml:space="preserve">. </w:t>
+        <w:t>. Sua empresa provavelmente é normal. Mas você pode ser diferente.</w:t>
       </w:r>
     </w:p>
     <w:p/>
@@ -291,31 +260,31 @@
         <w:pStyle w:val="Heading2"/>
       </w:pPr>
       <w:r>
-        <w:t>O Que Muda Quando Clareza Existe</w:t>
+        <w:t>O Que Muda Quando Clareza Existe?</w:t>
       </w:r>
     </w:p>
     <w:p/>
     <w:p>
       <w:r>
-        <w:t>Quando seu time tem clareza, três coisas mudam simultaneamente.</w:t>
+        <w:t>Quando seu time tem clareza, três coisas mudam simultaneamente, e nenhuma é pequena.</w:t>
       </w:r>
     </w:p>
     <w:p/>
     <w:p>
       <w:r>
-        <w:t>Primeiro: talento deixa de perguntar "posso fazer X?" e começa a propor "deveríamos fazer Y?". A conversação muda de permissão para contribuição.</w:t>
+        <w:t>Primeiro: talento deixa de perguntar "posso fazer X?" e começa a propor "deveríamos fazer Y?". A conversação muda de permissão para contribuição. Você sai do modo "gestor de tarefas" e entra no modo "gestor de estratégia".</w:t>
       </w:r>
     </w:p>
     <w:p/>
     <w:p>
       <w:r>
-        <w:t>Segundo: turnover de talento cai. Não porque ficou mais caro sair — talento sempre consegue sair — mas porque trabalho ficou significativo. Não há adivinhar.</w:t>
+        <w:t>Segundo: turnover de talento cai. Não porque ficou mais caro sair — talento sempre consegue sair — mas porque trabalho ficou significativo. Não há adivinhar. Não há frustração de semana toda refazendo coisa que não era prioritária. Não há saída.</w:t>
       </w:r>
     </w:p>
     <w:p/>
     <w:p>
       <w:r>
-        <w:t>Terceiro: velocidade aumenta. Quando time entende estratégia e tem autonomia, não precisa de aprovação em tudo. Decisões pequenas acontecem localmente. Velocidade sobe.</w:t>
+        <w:t>Terceiro: velocidade aumenta. Quando time entende estratégia e tem autonomia, não precisa de aprovação em tudo. Decisões pequenas acontecem localmente. Você não é gargalo. Velocidade sobe.</w:t>
       </w:r>
     </w:p>
     <w:p/>
@@ -343,7 +312,6 @@
     <w:p>
       <w:r>
         <w:rPr>
-          <w:color w:val="0000FF"/>
           <w:u w:val="single"/>
         </w:rPr>
         <w:t>Gallup Workplace Engagement Index (2024)</w:t>
@@ -353,7 +321,6 @@
     <w:p>
       <w:r>
         <w:rPr>
-          <w:color w:val="0000FF"/>
           <w:u w:val="single"/>
         </w:rPr>
         <w:t>Harvard Business Review — The Engagement Gap (2023)</w:t>
@@ -363,7 +330,6 @@
     <w:p>
       <w:r>
         <w:rPr>
-          <w:color w:val="0000FF"/>
           <w:u w:val="single"/>
         </w:rPr>
         <w:t>Korn Ferry — Leadership Research (2024)</w:t>
@@ -373,7 +339,6 @@
     <w:p>
       <w:r>
         <w:rPr>
-          <w:color w:val="0000FF"/>
           <w:u w:val="single"/>
         </w:rPr>
         <w:t>Google Re:Work (2024)</w:t>
@@ -383,7 +348,6 @@
     <w:p>
       <w:r>
         <w:rPr>
-          <w:color w:val="0000FF"/>
           <w:u w:val="single"/>
         </w:rPr>
         <w:t>McKinsey — Organizational Performance (2024)</w:t>

</xml_diff>